<commit_message>
Wstep i pierwsze menu
</commit_message>
<xml_diff>
--- a/dokumentacja.docx
+++ b/dokumentacja.docx
@@ -23,6 +23,24 @@
     <w:p>
       <w:r>
         <w:t>W wakacje czas płynie inaczej. Usunął mi się zapis ze szkoły i jakimś cudem dopiero udało mi się zgrać GitHuba i wszystko przygotować. Jak mówiłem, zmiana koncepcji wysoce prawdopodobna. Aktualnym planem jest gra w Snake’a z możliwością wyboru wielkości planszy z podanych oraz ilości punktów do ukończenia gry.</w:t>
+      </w:r>
+      <w:r>
+        <w:t xml:space="preserve"> Stworzyłem dodatkowy program o nazwie „proby”, aby wypróbować czy i jak działa tworzenie tego fajnego menu. Trzeba w nim użyć biblioteki &lt;conio.h&gt;, aby samo wciśnięcie klawisza liczyło się jako zmienna, bez konieczności klikania „enter”. Dzieki temu oraz czyszczeniu ekranu, można zrobić płynne menu z gotowymi opcjami wymiarów planszy dla naszego Snake’a. Nazwijmy go Jim. Następnie zapamiętałem schemat i nauczyłem się, </w:t>
+      </w:r>
+      <w:r>
+        <w:t>jak zrobić kod na to</w:t>
+      </w:r>
+      <w:r>
+        <w:t xml:space="preserve"> menu od podszewki. W tym projekcie ogółem dużo będzie pomocy GPT, ale uważam, że jeżeli każdą z tych rzeczy zapamiętam</w:t>
+      </w:r>
+      <w:r>
+        <w:t xml:space="preserve"> i będę w stanie użyć sam</w:t>
+      </w:r>
+      <w:r>
+        <w:t xml:space="preserve">, jest </w:t>
+      </w:r>
+      <w:r>
+        <w:t>to jak najbardziej akceptowalne. Zrobiłem też wstęp do gry oraz w końcu to menu do wyboru wymiarów planszy.</w:t>
       </w:r>
     </w:p>
     <w:sectPr>

</xml_diff>

<commit_message>
Dodanie systemu poruszania sie i pierwsze pojawienie sie Jima na planszy
</commit_message>
<xml_diff>
--- a/dokumentacja.docx
+++ b/dokumentacja.docx
@@ -212,7 +212,73 @@
         <w:t>28.08.2026</w:t>
       </w:r>
     </w:p>
-    <w:p/>
+    <w:p>
+      <w:r>
+        <w:rPr>
+          <w:noProof/>
+        </w:rPr>
+        <w:drawing>
+          <wp:anchor distT="0" distB="0" distL="114300" distR="114300" simplePos="0" relativeHeight="251661312" behindDoc="0" locked="0" layoutInCell="1" allowOverlap="1">
+            <wp:simplePos x="0" y="0"/>
+            <wp:positionH relativeFrom="column">
+              <wp:posOffset>-61595</wp:posOffset>
+            </wp:positionH>
+            <wp:positionV relativeFrom="paragraph">
+              <wp:posOffset>828040</wp:posOffset>
+            </wp:positionV>
+            <wp:extent cx="5759450" cy="1289050"/>
+            <wp:effectExtent l="19050" t="0" r="0" b="0"/>
+            <wp:wrapNone/>
+            <wp:docPr id="4" name="Obraz 3" descr="kod28.PNG"/>
+            <wp:cNvGraphicFramePr>
+              <a:graphicFrameLocks xmlns:a="http://schemas.openxmlformats.org/drawingml/2006/main" noChangeAspect="1"/>
+            </wp:cNvGraphicFramePr>
+            <a:graphic xmlns:a="http://schemas.openxmlformats.org/drawingml/2006/main">
+              <a:graphicData uri="http://schemas.openxmlformats.org/drawingml/2006/picture">
+                <pic:pic xmlns:pic="http://schemas.openxmlformats.org/drawingml/2006/picture">
+                  <pic:nvPicPr>
+                    <pic:cNvPr id="0" name="kod28.PNG"/>
+                    <pic:cNvPicPr/>
+                  </pic:nvPicPr>
+                  <pic:blipFill>
+                    <a:blip r:embed="rId9"/>
+                    <a:stretch>
+                      <a:fillRect/>
+                    </a:stretch>
+                  </pic:blipFill>
+                  <pic:spPr>
+                    <a:xfrm>
+                      <a:off x="0" y="0"/>
+                      <a:ext cx="5759450" cy="1289050"/>
+                    </a:xfrm>
+                    <a:prstGeom prst="rect">
+                      <a:avLst/>
+                    </a:prstGeom>
+                  </pic:spPr>
+                </pic:pic>
+              </a:graphicData>
+            </a:graphic>
+          </wp:anchor>
+        </w:drawing>
+      </w:r>
+      <w:r>
+        <w:t>Dziś mało, jedynie zapytanie o ilość jabłek dla Jima, czyli limit, po którym wygrywa się grę. Zablokowało mnie to, że nie wiedziałem jak zrobić te kwadraty w tablicy 2D, które będą głównym „budulcem” węża i jabłek. Za niedługo coś wymyślę. Ale za to myślałem dużo o sposobie poruszania się Jima i wydaje mi się, że to, co mam, może zadziałać, jak się jeszcze trochę dopracuje.</w:t>
+      </w:r>
+    </w:p>
+    <w:p/>
+    <w:p/>
+    <w:p/>
+    <w:p/>
+    <w:p>
+      <w:r>
+        <w:t>29.08.2026</w:t>
+      </w:r>
+    </w:p>
+    <w:p>
+      <w:r>
+        <w:t>System poruszania się działa niemal bez zarzutu. Choć na razie Jim to po prostu ciąg hashtagów, to już można nim skręcać! Zadbałem też, aby nie dało się skrecić o 180 stopni naraz, to jest np. skręcić w tył, gdy przed chwilą było prosto. Wtedy zwyczajnie Jim się nie przejmuje i idzie dalej prosto. Żeby się cofnąć, trzeba skręcić najpierw w bok, a potem jeszcze raz. Dodatkowo, gdy Jim wejdzie w samego siebie, wyskakuje od razu ekran przegranej. Zostało teraz dodanie jabłek, „zamknięcie” granic planszy i dopracowanie wyglądu, może poprzez te kwadraty, co nie mogę ich znaleźć.</w:t>
+      </w:r>
+    </w:p>
     <w:sectPr>
       <w:pgSz w:w="11906" w:h="16838"/>
       <w:pgMar w:top="1417" w:right="1417" w:bottom="1417" w:left="1417" w:header="708" w:footer="708" w:gutter="0"/>

</xml_diff>

<commit_message>
jablka i dopracowanie ruchu oraz co nieco wyglad
</commit_message>
<xml_diff>
--- a/dokumentacja.docx
+++ b/dokumentacja.docx
@@ -279,6 +279,12 @@
         <w:t>System poruszania się działa niemal bez zarzutu. Choć na razie Jim to po prostu ciąg hashtagów, to już można nim skręcać! Zadbałem też, aby nie dało się skrecić o 180 stopni naraz, to jest np. skręcić w tył, gdy przed chwilą było prosto. Wtedy zwyczajnie Jim się nie przejmuje i idzie dalej prosto. Żeby się cofnąć, trzeba skręcić najpierw w bok, a potem jeszcze raz. Dodatkowo, gdy Jim wejdzie w samego siebie, wyskakuje od razu ekran przegranej. Zostało teraz dodanie jabłek, „zamknięcie” granic planszy i dopracowanie wyglądu, może poprzez te kwadraty, co nie mogę ich znaleźć.</w:t>
       </w:r>
     </w:p>
+    <w:p>
+      <w:r>
+        <w:t>30.08.2026</w:t>
+      </w:r>
+    </w:p>
+    <w:p/>
     <w:sectPr>
       <w:pgSz w:w="11906" w:h="16838"/>
       <w:pgMar w:top="1417" w:right="1417" w:bottom="1417" w:left="1417" w:header="708" w:footer="708" w:gutter="0"/>

</xml_diff>

<commit_message>
Dodatek do jablek, modulacja predkosci i estetyka z KWADRATAMI
</commit_message>
<xml_diff>
--- a/dokumentacja.docx
+++ b/dokumentacja.docx
@@ -1009,6 +1009,28 @@
       </w:r>
       <w:r>
         <w:t>a na przesuwanie kursora na początek, żeby teraz przesuwał się tam, gdzie chcę. Wszystko dlatego, że czasami współrzędne są jednocyfrowe, a czasami dwu i nadpisuje tylko część, a końcówka pozostaje. Chociaż… Właśnie wymyśliłem, że mogę przecież wypisywać współrzędne jednocyfrowe z zerem na początku…</w:t>
+      </w:r>
+      <w:r>
+        <w:t xml:space="preserve"> </w:t>
+      </w:r>
+    </w:p>
+    <w:p>
+      <w:r>
+        <w:t xml:space="preserve">Udało się w ten sposób. Dodałem też możliwość zmiany ilości jabłek, które występują na planszy naraz i zmiany prędkości. Choć od tego, jak szybko się porusza zależy tez to, jak szybko generuje całą tablice, bo </w:t>
+      </w:r>
+      <w:r>
+        <w:rPr>
+          <w:i/>
+        </w:rPr>
+        <w:t>cout</w:t>
+      </w:r>
+      <w:r>
+        <w:t>y trochę czasu zajmują…</w:t>
+      </w:r>
+    </w:p>
+    <w:p>
+      <w:r>
+        <w:t>UDAŁO SIĘ!!! W KOŃCU ODKRYŁEM SEKRET TYCH KWADRATÓW!!! Z lekką pomocą AI i asystą Pauliny Litwińskiej. Doszedłem też do wniosku, że przecież mogę dać spacje między każdą kolumnę, żeby plansza nie była taka prostokątna, a bardziej kwadratowa. Więc udało mi się to wszystko osiągnąć po 23:00 31 sierpnia. Czyli jeszcze wakacje :1 Ewentualnie jutro dopracuję dwie drobne rzeczy, które nic tragicznego nie wnoszą do gry, ale jednak są błędne. Mianowicie czasami wciskane klawisze strzałek się stackują i „czekają w kolejce” oraz nie można się kręcić w kółko, gdy długość Jima wynosi 4.</w:t>
       </w:r>
     </w:p>
     <w:sectPr>

</xml_diff>

<commit_message>
ostanie poprawki i KONIEC
</commit_message>
<xml_diff>
--- a/dokumentacja.docx
+++ b/dokumentacja.docx
@@ -1030,7 +1030,300 @@
     </w:p>
     <w:p>
       <w:r>
+        <w:rPr>
+          <w:noProof/>
+        </w:rPr>
+        <w:drawing>
+          <wp:anchor distT="0" distB="0" distL="114300" distR="114300" simplePos="0" relativeHeight="251674624" behindDoc="0" locked="0" layoutInCell="1" allowOverlap="1">
+            <wp:simplePos x="0" y="0"/>
+            <wp:positionH relativeFrom="column">
+              <wp:posOffset>2300605</wp:posOffset>
+            </wp:positionH>
+            <wp:positionV relativeFrom="paragraph">
+              <wp:posOffset>1254125</wp:posOffset>
+            </wp:positionV>
+            <wp:extent cx="3486150" cy="2273300"/>
+            <wp:effectExtent l="19050" t="0" r="0" b="0"/>
+            <wp:wrapNone/>
+            <wp:docPr id="16" name="Obraz 15" descr="GPT31.PNG"/>
+            <wp:cNvGraphicFramePr>
+              <a:graphicFrameLocks xmlns:a="http://schemas.openxmlformats.org/drawingml/2006/main" noChangeAspect="1"/>
+            </wp:cNvGraphicFramePr>
+            <a:graphic xmlns:a="http://schemas.openxmlformats.org/drawingml/2006/main">
+              <a:graphicData uri="http://schemas.openxmlformats.org/drawingml/2006/picture">
+                <pic:pic xmlns:pic="http://schemas.openxmlformats.org/drawingml/2006/picture">
+                  <pic:nvPicPr>
+                    <pic:cNvPr id="0" name="GPT31.PNG"/>
+                    <pic:cNvPicPr/>
+                  </pic:nvPicPr>
+                  <pic:blipFill>
+                    <a:blip r:embed="rId20"/>
+                    <a:stretch>
+                      <a:fillRect/>
+                    </a:stretch>
+                  </pic:blipFill>
+                  <pic:spPr>
+                    <a:xfrm>
+                      <a:off x="0" y="0"/>
+                      <a:ext cx="3486150" cy="2273300"/>
+                    </a:xfrm>
+                    <a:prstGeom prst="rect">
+                      <a:avLst/>
+                    </a:prstGeom>
+                  </pic:spPr>
+                </pic:pic>
+              </a:graphicData>
+            </a:graphic>
+          </wp:anchor>
+        </w:drawing>
+      </w:r>
+      <w:r>
+        <w:rPr>
+          <w:noProof/>
+        </w:rPr>
+        <w:drawing>
+          <wp:anchor distT="0" distB="0" distL="114300" distR="114300" simplePos="0" relativeHeight="251672576" behindDoc="0" locked="0" layoutInCell="1" allowOverlap="1">
+            <wp:simplePos x="0" y="0"/>
+            <wp:positionH relativeFrom="column">
+              <wp:posOffset>-671195</wp:posOffset>
+            </wp:positionH>
+            <wp:positionV relativeFrom="paragraph">
+              <wp:posOffset>1285875</wp:posOffset>
+            </wp:positionV>
+            <wp:extent cx="2737972" cy="2832100"/>
+            <wp:effectExtent l="19050" t="0" r="5228" b="0"/>
+            <wp:wrapNone/>
+            <wp:docPr id="15" name="Obraz 14" descr="terminal31.PNG"/>
+            <wp:cNvGraphicFramePr>
+              <a:graphicFrameLocks xmlns:a="http://schemas.openxmlformats.org/drawingml/2006/main" noChangeAspect="1"/>
+            </wp:cNvGraphicFramePr>
+            <a:graphic xmlns:a="http://schemas.openxmlformats.org/drawingml/2006/main">
+              <a:graphicData uri="http://schemas.openxmlformats.org/drawingml/2006/picture">
+                <pic:pic xmlns:pic="http://schemas.openxmlformats.org/drawingml/2006/picture">
+                  <pic:nvPicPr>
+                    <pic:cNvPr id="0" name="terminal31.PNG"/>
+                    <pic:cNvPicPr/>
+                  </pic:nvPicPr>
+                  <pic:blipFill>
+                    <a:blip r:embed="rId21"/>
+                    <a:stretch>
+                      <a:fillRect/>
+                    </a:stretch>
+                  </pic:blipFill>
+                  <pic:spPr>
+                    <a:xfrm>
+                      <a:off x="0" y="0"/>
+                      <a:ext cx="2737972" cy="2832100"/>
+                    </a:xfrm>
+                    <a:prstGeom prst="rect">
+                      <a:avLst/>
+                    </a:prstGeom>
+                  </pic:spPr>
+                </pic:pic>
+              </a:graphicData>
+            </a:graphic>
+          </wp:anchor>
+        </w:drawing>
+      </w:r>
+      <w:r>
         <w:t>UDAŁO SIĘ!!! W KOŃCU ODKRYŁEM SEKRET TYCH KWADRATÓW!!! Z lekką pomocą AI i asystą Pauliny Litwińskiej. Doszedłem też do wniosku, że przecież mogę dać spacje między każdą kolumnę, żeby plansza nie była taka prostokątna, a bardziej kwadratowa. Więc udało mi się to wszystko osiągnąć po 23:00 31 sierpnia. Czyli jeszcze wakacje :1 Ewentualnie jutro dopracuję dwie drobne rzeczy, które nic tragicznego nie wnoszą do gry, ale jednak są błędne. Mianowicie czasami wciskane klawisze strzałek się stackują i „czekają w kolejce” oraz nie można się kręcić w kółko, gdy długość Jima wynosi 4.</w:t>
+      </w:r>
+    </w:p>
+    <w:p/>
+    <w:p/>
+    <w:p/>
+    <w:p/>
+    <w:p/>
+    <w:p/>
+    <w:p/>
+    <w:p>
+      <w:r>
+        <w:rPr>
+          <w:noProof/>
+        </w:rPr>
+        <w:drawing>
+          <wp:anchor distT="0" distB="0" distL="114300" distR="114300" simplePos="0" relativeHeight="251673600" behindDoc="0" locked="0" layoutInCell="1" allowOverlap="1">
+            <wp:simplePos x="0" y="0"/>
+            <wp:positionH relativeFrom="column">
+              <wp:posOffset>2529205</wp:posOffset>
+            </wp:positionH>
+            <wp:positionV relativeFrom="paragraph">
+              <wp:posOffset>50800</wp:posOffset>
+            </wp:positionV>
+            <wp:extent cx="3035300" cy="806450"/>
+            <wp:effectExtent l="19050" t="0" r="0" b="0"/>
+            <wp:wrapNone/>
+            <wp:docPr id="17" name="Obraz 16" descr="kod.311.PNG"/>
+            <wp:cNvGraphicFramePr>
+              <a:graphicFrameLocks xmlns:a="http://schemas.openxmlformats.org/drawingml/2006/main" noChangeAspect="1"/>
+            </wp:cNvGraphicFramePr>
+            <a:graphic xmlns:a="http://schemas.openxmlformats.org/drawingml/2006/main">
+              <a:graphicData uri="http://schemas.openxmlformats.org/drawingml/2006/picture">
+                <pic:pic xmlns:pic="http://schemas.openxmlformats.org/drawingml/2006/picture">
+                  <pic:nvPicPr>
+                    <pic:cNvPr id="0" name="kod.311.PNG"/>
+                    <pic:cNvPicPr/>
+                  </pic:nvPicPr>
+                  <pic:blipFill>
+                    <a:blip r:embed="rId22"/>
+                    <a:stretch>
+                      <a:fillRect/>
+                    </a:stretch>
+                  </pic:blipFill>
+                  <pic:spPr>
+                    <a:xfrm>
+                      <a:off x="0" y="0"/>
+                      <a:ext cx="3035300" cy="806450"/>
+                    </a:xfrm>
+                    <a:prstGeom prst="rect">
+                      <a:avLst/>
+                    </a:prstGeom>
+                  </pic:spPr>
+                </pic:pic>
+              </a:graphicData>
+            </a:graphic>
+          </wp:anchor>
+        </w:drawing>
+      </w:r>
+    </w:p>
+    <w:p>
+      <w:r>
+        <w:lastRenderedPageBreak/>
+        <w:t>1.09.2026</w:t>
+      </w:r>
+    </w:p>
+    <w:p>
+      <w:r>
+        <w:rPr>
+          <w:noProof/>
+        </w:rPr>
+        <w:drawing>
+          <wp:anchor distT="0" distB="0" distL="114300" distR="114300" simplePos="0" relativeHeight="251676672" behindDoc="0" locked="0" layoutInCell="1" allowOverlap="1">
+            <wp:simplePos x="0" y="0"/>
+            <wp:positionH relativeFrom="column">
+              <wp:posOffset>-791845</wp:posOffset>
+            </wp:positionH>
+            <wp:positionV relativeFrom="paragraph">
+              <wp:posOffset>796290</wp:posOffset>
+            </wp:positionV>
+            <wp:extent cx="5219700" cy="1358900"/>
+            <wp:effectExtent l="19050" t="0" r="0" b="0"/>
+            <wp:wrapNone/>
+            <wp:docPr id="18" name="Obraz 17" descr="kod011.PNG"/>
+            <wp:cNvGraphicFramePr>
+              <a:graphicFrameLocks xmlns:a="http://schemas.openxmlformats.org/drawingml/2006/main" noChangeAspect="1"/>
+            </wp:cNvGraphicFramePr>
+            <a:graphic xmlns:a="http://schemas.openxmlformats.org/drawingml/2006/main">
+              <a:graphicData uri="http://schemas.openxmlformats.org/drawingml/2006/picture">
+                <pic:pic xmlns:pic="http://schemas.openxmlformats.org/drawingml/2006/picture">
+                  <pic:nvPicPr>
+                    <pic:cNvPr id="0" name="kod011.PNG"/>
+                    <pic:cNvPicPr/>
+                  </pic:nvPicPr>
+                  <pic:blipFill>
+                    <a:blip r:embed="rId23"/>
+                    <a:stretch>
+                      <a:fillRect/>
+                    </a:stretch>
+                  </pic:blipFill>
+                  <pic:spPr>
+                    <a:xfrm>
+                      <a:off x="0" y="0"/>
+                      <a:ext cx="5219700" cy="1358900"/>
+                    </a:xfrm>
+                    <a:prstGeom prst="rect">
+                      <a:avLst/>
+                    </a:prstGeom>
+                  </pic:spPr>
+                </pic:pic>
+              </a:graphicData>
+            </a:graphic>
+          </wp:anchor>
+        </w:drawing>
+      </w:r>
+      <w:r>
+        <w:t>Udało się ;) Kręcenie się w kółko jest już możliwe, a z małą pomocą ChataGPT  zlikwidowałem też to „stackowanie się strzałek”, choć bardziej mi przeszkodził niż pomógł.</w:t>
+      </w:r>
+      <w:r>
+        <w:t xml:space="preserve"> Jeszcze</w:t>
+      </w:r>
+      <w:r>
+        <w:t xml:space="preserve"> jedna drobna rzecz, dzięki AI, sprawiłem, aby cał</w:t>
+      </w:r>
+      <w:r>
+        <w:t xml:space="preserve">y kod nie crushował się, gdy w </w:t>
+      </w:r>
+      <w:r>
+        <w:rPr>
+          <w:i/>
+        </w:rPr>
+        <w:t>cin</w:t>
+      </w:r>
+      <w:r>
+        <w:t>a, który miał być liczbą, wpisze się literę.</w:t>
+      </w:r>
+    </w:p>
+    <w:p>
+      <w:r>
+        <w:rPr>
+          <w:noProof/>
+        </w:rPr>
+        <w:drawing>
+          <wp:anchor distT="0" distB="0" distL="114300" distR="114300" simplePos="0" relativeHeight="251675648" behindDoc="0" locked="0" layoutInCell="1" allowOverlap="1">
+            <wp:simplePos x="0" y="0"/>
+            <wp:positionH relativeFrom="column">
+              <wp:posOffset>4554855</wp:posOffset>
+            </wp:positionH>
+            <wp:positionV relativeFrom="paragraph">
+              <wp:posOffset>31115</wp:posOffset>
+            </wp:positionV>
+            <wp:extent cx="1765300" cy="977900"/>
+            <wp:effectExtent l="19050" t="0" r="6350" b="0"/>
+            <wp:wrapNone/>
+            <wp:docPr id="19" name="Obraz 18" descr="kod012.PNG"/>
+            <wp:cNvGraphicFramePr>
+              <a:graphicFrameLocks xmlns:a="http://schemas.openxmlformats.org/drawingml/2006/main" noChangeAspect="1"/>
+            </wp:cNvGraphicFramePr>
+            <a:graphic xmlns:a="http://schemas.openxmlformats.org/drawingml/2006/main">
+              <a:graphicData uri="http://schemas.openxmlformats.org/drawingml/2006/picture">
+                <pic:pic xmlns:pic="http://schemas.openxmlformats.org/drawingml/2006/picture">
+                  <pic:nvPicPr>
+                    <pic:cNvPr id="0" name="kod012.PNG"/>
+                    <pic:cNvPicPr/>
+                  </pic:nvPicPr>
+                  <pic:blipFill>
+                    <a:blip r:embed="rId24"/>
+                    <a:stretch>
+                      <a:fillRect/>
+                    </a:stretch>
+                  </pic:blipFill>
+                  <pic:spPr>
+                    <a:xfrm>
+                      <a:off x="0" y="0"/>
+                      <a:ext cx="1765300" cy="977900"/>
+                    </a:xfrm>
+                    <a:prstGeom prst="rect">
+                      <a:avLst/>
+                    </a:prstGeom>
+                  </pic:spPr>
+                </pic:pic>
+              </a:graphicData>
+            </a:graphic>
+          </wp:anchor>
+        </w:drawing>
+      </w:r>
+    </w:p>
+    <w:p/>
+    <w:p/>
+    <w:p/>
+    <w:p/>
+    <w:p/>
+    <w:p>
+      <w:r>
+        <w:t>No to co, projekt uważam za zakończony. Dziękuję za uwagę.</w:t>
+      </w:r>
+      <w:r>
+        <w:t xml:space="preserve"> </w:t>
       </w:r>
     </w:p>
     <w:sectPr>

</xml_diff>